<commit_message>
Implementa Lead Gate no WhatsApp, remove telefones em texto e cria painel secreto de leads com bloqueio no robots
</commit_message>
<xml_diff>
--- a/Artigos para criar no Blog FG Car Oficina.docx
+++ b/Artigos para criar no Blog FG Car Oficina.docx
@@ -24,13 +24,10 @@
           <w:szCs w:val="36"/>
           <w:lang w:eastAsia="pt-BR"/>
         </w:rPr>
-        <w:t>Artigos para criar no Blog FG Car Oficina</w:t>
-      </w:r>
-    </w:p>
-    <w:p>
-      <w:pPr>
-        <w:spacing w:before="100" w:beforeAutospacing="1" w:after="100" w:afterAutospacing="1" w:line="240" w:lineRule="auto"/>
-        <w:outlineLvl w:val="1"/>
+        <w:t xml:space="preserve">Artigos para criar no Blog FG </w:t>
+      </w:r>
+      <w:proofErr w:type="spellStart"/>
+      <w:r>
         <w:rPr>
           <w:rFonts w:ascii="Segoe UI Symbol" w:eastAsia="Times New Roman" w:hAnsi="Segoe UI Symbol" w:cs="Segoe UI Symbol"/>
           <w:b/>
@@ -39,7 +36,20 @@
           <w:szCs w:val="36"/>
           <w:lang w:eastAsia="pt-BR"/>
         </w:rPr>
-      </w:pPr>
+        <w:t>Car</w:t>
+      </w:r>
+      <w:proofErr w:type="spellEnd"/>
+      <w:r>
+        <w:rPr>
+          <w:rFonts w:ascii="Segoe UI Symbol" w:eastAsia="Times New Roman" w:hAnsi="Segoe UI Symbol" w:cs="Segoe UI Symbol"/>
+          <w:b/>
+          <w:bCs/>
+          <w:sz w:val="36"/>
+          <w:szCs w:val="36"/>
+          <w:lang w:eastAsia="pt-BR"/>
+        </w:rPr>
+        <w:t xml:space="preserve"> Oficina</w:t>
+      </w:r>
     </w:p>
     <w:p>
       <w:pPr>
@@ -446,7 +456,19 @@
           <w:szCs w:val="27"/>
           <w:lang w:eastAsia="pt-BR"/>
         </w:rPr>
-        <w:t>🧰 3. Restauração de veículos</w:t>
+        <w:t>Categoria -</w:t>
+      </w:r>
+      <w:r>
+        <w:rPr>
+          <w:rFonts w:ascii="Times New Roman" w:eastAsia="Times New Roman" w:hAnsi="Times New Roman" w:cs="Times New Roman"/>
+          <w:b/>
+          <w:bCs/>
+          <w:color w:val="FF0000"/>
+          <w:sz w:val="27"/>
+          <w:szCs w:val="27"/>
+          <w:lang w:eastAsia="pt-BR"/>
+        </w:rPr>
+        <w:t xml:space="preserve"> Restauração de veículos</w:t>
       </w:r>
     </w:p>
     <w:p>
@@ -587,6 +609,7 @@
           <w:rFonts w:ascii="Times New Roman" w:eastAsia="Times New Roman" w:hAnsi="Times New Roman" w:cs="Times New Roman"/>
           <w:b/>
           <w:bCs/>
+          <w:color w:val="FF0000"/>
           <w:sz w:val="27"/>
           <w:szCs w:val="27"/>
           <w:lang w:eastAsia="pt-BR"/>
@@ -597,6 +620,7 @@
           <w:rFonts w:ascii="Times New Roman" w:eastAsia="Times New Roman" w:hAnsi="Times New Roman" w:cs="Times New Roman"/>
           <w:b/>
           <w:bCs/>
+          <w:color w:val="FF0000"/>
           <w:sz w:val="27"/>
           <w:szCs w:val="27"/>
           <w:lang w:eastAsia="pt-BR"/>
@@ -608,6 +632,7 @@
           <w:rFonts w:ascii="Times New Roman" w:eastAsia="Times New Roman" w:hAnsi="Times New Roman" w:cs="Times New Roman"/>
           <w:b/>
           <w:bCs/>
+          <w:color w:val="FF0000"/>
           <w:sz w:val="27"/>
           <w:szCs w:val="27"/>
           <w:lang w:eastAsia="pt-BR"/>
@@ -624,15 +649,17 @@
         <w:spacing w:before="100" w:beforeAutospacing="1" w:after="100" w:afterAutospacing="1" w:line="240" w:lineRule="auto"/>
         <w:rPr>
           <w:rFonts w:ascii="Times New Roman" w:eastAsia="Times New Roman" w:hAnsi="Times New Roman" w:cs="Times New Roman"/>
-          <w:sz w:val="24"/>
-          <w:szCs w:val="24"/>
-          <w:lang w:eastAsia="pt-BR"/>
-        </w:rPr>
-      </w:pPr>
-      <w:r>
-        <w:rPr>
-          <w:rFonts w:ascii="Times New Roman" w:eastAsia="Times New Roman" w:hAnsi="Times New Roman" w:cs="Times New Roman"/>
-          <w:bCs/>
+          <w:color w:val="FF0000"/>
+          <w:sz w:val="24"/>
+          <w:szCs w:val="24"/>
+          <w:lang w:eastAsia="pt-BR"/>
+        </w:rPr>
+      </w:pPr>
+      <w:r>
+        <w:rPr>
+          <w:rFonts w:ascii="Times New Roman" w:eastAsia="Times New Roman" w:hAnsi="Times New Roman" w:cs="Times New Roman"/>
+          <w:bCs/>
+          <w:color w:val="FF0000"/>
           <w:sz w:val="24"/>
           <w:szCs w:val="24"/>
           <w:lang w:eastAsia="pt-BR"/>
@@ -649,15 +676,17 @@
         <w:spacing w:before="100" w:beforeAutospacing="1" w:after="100" w:afterAutospacing="1" w:line="240" w:lineRule="auto"/>
         <w:rPr>
           <w:rFonts w:ascii="Times New Roman" w:eastAsia="Times New Roman" w:hAnsi="Times New Roman" w:cs="Times New Roman"/>
-          <w:sz w:val="24"/>
-          <w:szCs w:val="24"/>
-          <w:lang w:eastAsia="pt-BR"/>
-        </w:rPr>
-      </w:pPr>
-      <w:r>
-        <w:rPr>
-          <w:rFonts w:ascii="Times New Roman" w:eastAsia="Times New Roman" w:hAnsi="Times New Roman" w:cs="Times New Roman"/>
-          <w:bCs/>
+          <w:color w:val="FF0000"/>
+          <w:sz w:val="24"/>
+          <w:szCs w:val="24"/>
+          <w:lang w:eastAsia="pt-BR"/>
+        </w:rPr>
+      </w:pPr>
+      <w:r>
+        <w:rPr>
+          <w:rFonts w:ascii="Times New Roman" w:eastAsia="Times New Roman" w:hAnsi="Times New Roman" w:cs="Times New Roman"/>
+          <w:bCs/>
+          <w:color w:val="FF0000"/>
           <w:sz w:val="24"/>
           <w:szCs w:val="24"/>
           <w:lang w:eastAsia="pt-BR"/>
@@ -674,15 +703,17 @@
         <w:spacing w:before="100" w:beforeAutospacing="1" w:after="100" w:afterAutospacing="1" w:line="240" w:lineRule="auto"/>
         <w:rPr>
           <w:rFonts w:ascii="Times New Roman" w:eastAsia="Times New Roman" w:hAnsi="Times New Roman" w:cs="Times New Roman"/>
-          <w:sz w:val="24"/>
-          <w:szCs w:val="24"/>
-          <w:lang w:eastAsia="pt-BR"/>
-        </w:rPr>
-      </w:pPr>
-      <w:r>
-        <w:rPr>
-          <w:rFonts w:ascii="Times New Roman" w:eastAsia="Times New Roman" w:hAnsi="Times New Roman" w:cs="Times New Roman"/>
-          <w:bCs/>
+          <w:color w:val="FF0000"/>
+          <w:sz w:val="24"/>
+          <w:szCs w:val="24"/>
+          <w:lang w:eastAsia="pt-BR"/>
+        </w:rPr>
+      </w:pPr>
+      <w:r>
+        <w:rPr>
+          <w:rFonts w:ascii="Times New Roman" w:eastAsia="Times New Roman" w:hAnsi="Times New Roman" w:cs="Times New Roman"/>
+          <w:bCs/>
+          <w:color w:val="FF0000"/>
           <w:sz w:val="24"/>
           <w:szCs w:val="24"/>
           <w:lang w:eastAsia="pt-BR"/>
@@ -699,15 +730,17 @@
         <w:spacing w:before="100" w:beforeAutospacing="1" w:after="100" w:afterAutospacing="1" w:line="240" w:lineRule="auto"/>
         <w:rPr>
           <w:rFonts w:ascii="Times New Roman" w:eastAsia="Times New Roman" w:hAnsi="Times New Roman" w:cs="Times New Roman"/>
-          <w:sz w:val="24"/>
-          <w:szCs w:val="24"/>
-          <w:lang w:eastAsia="pt-BR"/>
-        </w:rPr>
-      </w:pPr>
-      <w:r>
-        <w:rPr>
-          <w:rFonts w:ascii="Times New Roman" w:eastAsia="Times New Roman" w:hAnsi="Times New Roman" w:cs="Times New Roman"/>
-          <w:bCs/>
+          <w:color w:val="FF0000"/>
+          <w:sz w:val="24"/>
+          <w:szCs w:val="24"/>
+          <w:lang w:eastAsia="pt-BR"/>
+        </w:rPr>
+      </w:pPr>
+      <w:r>
+        <w:rPr>
+          <w:rFonts w:ascii="Times New Roman" w:eastAsia="Times New Roman" w:hAnsi="Times New Roman" w:cs="Times New Roman"/>
+          <w:bCs/>
+          <w:color w:val="FF0000"/>
           <w:sz w:val="24"/>
           <w:szCs w:val="24"/>
           <w:lang w:eastAsia="pt-BR"/>
@@ -759,19 +792,54 @@
           <w:szCs w:val="27"/>
           <w:lang w:eastAsia="pt-BR"/>
         </w:rPr>
-        <w:t>Categoria -</w:t>
-      </w:r>
-      <w:r>
-        <w:rPr>
-          <w:rFonts w:ascii="Times New Roman" w:eastAsia="Times New Roman" w:hAnsi="Times New Roman" w:cs="Times New Roman"/>
+        <w:t xml:space="preserve">Categoria </w:t>
+      </w:r>
+      <w:r>
+        <w:rPr>
+          <w:rFonts w:ascii="Segoe UI Symbol" w:eastAsia="Times New Roman" w:hAnsi="Segoe UI Symbol" w:cs="Segoe UI Symbol"/>
           <w:b/>
           <w:bCs/>
           <w:sz w:val="27"/>
           <w:szCs w:val="27"/>
           <w:lang w:eastAsia="pt-BR"/>
         </w:rPr>
-        <w:t xml:space="preserve"> Autoridade local e intenção de busca</w:t>
-      </w:r>
+        <w:t>–</w:t>
+      </w:r>
+      <w:r>
+        <w:rPr>
+          <w:rFonts w:ascii="Times New Roman" w:eastAsia="Times New Roman" w:hAnsi="Times New Roman" w:cs="Times New Roman"/>
+          <w:b/>
+          <w:bCs/>
+          <w:sz w:val="27"/>
+          <w:szCs w:val="27"/>
+          <w:lang w:eastAsia="pt-BR"/>
+        </w:rPr>
+        <w:t xml:space="preserve"> </w:t>
+      </w:r>
+      <w:r>
+        <w:rPr>
+          <w:rFonts w:ascii="Times New Roman" w:eastAsia="Times New Roman" w:hAnsi="Times New Roman" w:cs="Times New Roman"/>
+          <w:b/>
+          <w:bCs/>
+          <w:sz w:val="27"/>
+          <w:szCs w:val="27"/>
+          <w:lang w:eastAsia="pt-BR"/>
+        </w:rPr>
+        <w:t xml:space="preserve">Super Dicas de Funilaria e Pintura </w:t>
+      </w:r>
+      <w:proofErr w:type="spellStart"/>
+      <w:r>
+        <w:rPr>
+          <w:rFonts w:ascii="Times New Roman" w:eastAsia="Times New Roman" w:hAnsi="Times New Roman" w:cs="Times New Roman"/>
+          <w:b/>
+          <w:bCs/>
+          <w:sz w:val="27"/>
+          <w:szCs w:val="27"/>
+          <w:lang w:eastAsia="pt-BR"/>
+        </w:rPr>
+        <w:t>FGCar</w:t>
+      </w:r>
+      <w:proofErr w:type="spellEnd"/>
     </w:p>
     <w:p>
       <w:pPr>
@@ -782,26 +850,28 @@
         <w:spacing w:before="100" w:beforeAutospacing="1" w:after="100" w:afterAutospacing="1" w:line="240" w:lineRule="auto"/>
         <w:rPr>
           <w:rFonts w:ascii="Times New Roman" w:eastAsia="Times New Roman" w:hAnsi="Times New Roman" w:cs="Times New Roman"/>
-          <w:sz w:val="24"/>
-          <w:szCs w:val="24"/>
-          <w:lang w:eastAsia="pt-BR"/>
-        </w:rPr>
-      </w:pPr>
-      <w:r>
-        <w:rPr>
-          <w:rFonts w:ascii="Times New Roman" w:eastAsia="Times New Roman" w:hAnsi="Times New Roman" w:cs="Times New Roman"/>
-          <w:bCs/>
-          <w:sz w:val="24"/>
-          <w:szCs w:val="24"/>
-          <w:lang w:eastAsia="pt-BR"/>
-        </w:rPr>
-        <w:lastRenderedPageBreak/>
+          <w:color w:val="FF0000"/>
+          <w:sz w:val="24"/>
+          <w:szCs w:val="24"/>
+          <w:lang w:eastAsia="pt-BR"/>
+        </w:rPr>
+      </w:pPr>
+      <w:r>
+        <w:rPr>
+          <w:rFonts w:ascii="Times New Roman" w:eastAsia="Times New Roman" w:hAnsi="Times New Roman" w:cs="Times New Roman"/>
+          <w:bCs/>
+          <w:color w:val="FF0000"/>
+          <w:sz w:val="24"/>
+          <w:szCs w:val="24"/>
+          <w:lang w:eastAsia="pt-BR"/>
+        </w:rPr>
         <w:t xml:space="preserve">Oficina de Funilaria e Pintura em </w:t>
       </w:r>
       <w:r>
         <w:rPr>
           <w:rFonts w:ascii="Times New Roman" w:eastAsia="Times New Roman" w:hAnsi="Times New Roman" w:cs="Times New Roman"/>
           <w:bCs/>
+          <w:color w:val="FF0000"/>
           <w:sz w:val="24"/>
           <w:szCs w:val="24"/>
           <w:lang w:eastAsia="pt-BR"/>
@@ -812,6 +882,7 @@
         <w:rPr>
           <w:rFonts w:ascii="Times New Roman" w:eastAsia="Times New Roman" w:hAnsi="Times New Roman" w:cs="Times New Roman"/>
           <w:bCs/>
+          <w:color w:val="FF0000"/>
           <w:sz w:val="24"/>
           <w:szCs w:val="24"/>
           <w:lang w:eastAsia="pt-BR"/>
@@ -828,15 +899,17 @@
         <w:spacing w:before="100" w:beforeAutospacing="1" w:after="100" w:afterAutospacing="1" w:line="240" w:lineRule="auto"/>
         <w:rPr>
           <w:rFonts w:ascii="Times New Roman" w:eastAsia="Times New Roman" w:hAnsi="Times New Roman" w:cs="Times New Roman"/>
-          <w:sz w:val="24"/>
-          <w:szCs w:val="24"/>
-          <w:lang w:eastAsia="pt-BR"/>
-        </w:rPr>
-      </w:pPr>
-      <w:r>
-        <w:rPr>
-          <w:rFonts w:ascii="Times New Roman" w:eastAsia="Times New Roman" w:hAnsi="Times New Roman" w:cs="Times New Roman"/>
-          <w:bCs/>
+          <w:color w:val="FF0000"/>
+          <w:sz w:val="24"/>
+          <w:szCs w:val="24"/>
+          <w:lang w:eastAsia="pt-BR"/>
+        </w:rPr>
+      </w:pPr>
+      <w:r>
+        <w:rPr>
+          <w:rFonts w:ascii="Times New Roman" w:eastAsia="Times New Roman" w:hAnsi="Times New Roman" w:cs="Times New Roman"/>
+          <w:bCs/>
+          <w:color w:val="FF0000"/>
           <w:sz w:val="24"/>
           <w:szCs w:val="24"/>
           <w:lang w:eastAsia="pt-BR"/>
@@ -853,19 +926,22 @@
         <w:spacing w:before="100" w:beforeAutospacing="1" w:after="100" w:afterAutospacing="1" w:line="240" w:lineRule="auto"/>
         <w:rPr>
           <w:rFonts w:ascii="Times New Roman" w:eastAsia="Times New Roman" w:hAnsi="Times New Roman" w:cs="Times New Roman"/>
-          <w:sz w:val="24"/>
-          <w:szCs w:val="24"/>
-          <w:lang w:eastAsia="pt-BR"/>
-        </w:rPr>
-      </w:pPr>
-      <w:r>
-        <w:rPr>
-          <w:rFonts w:ascii="Times New Roman" w:eastAsia="Times New Roman" w:hAnsi="Times New Roman" w:cs="Times New Roman"/>
-          <w:bCs/>
-          <w:sz w:val="24"/>
-          <w:szCs w:val="24"/>
-          <w:lang w:eastAsia="pt-BR"/>
-        </w:rPr>
+          <w:color w:val="FF0000"/>
+          <w:sz w:val="24"/>
+          <w:szCs w:val="24"/>
+          <w:lang w:eastAsia="pt-BR"/>
+        </w:rPr>
+      </w:pPr>
+      <w:r>
+        <w:rPr>
+          <w:rFonts w:ascii="Times New Roman" w:eastAsia="Times New Roman" w:hAnsi="Times New Roman" w:cs="Times New Roman"/>
+          <w:bCs/>
+          <w:color w:val="FF0000"/>
+          <w:sz w:val="24"/>
+          <w:szCs w:val="24"/>
+          <w:lang w:eastAsia="pt-BR"/>
+        </w:rPr>
+        <w:lastRenderedPageBreak/>
         <w:t>O que avaliar em um orçamento de funilaria e pintura antes de aprovar o serviço</w:t>
       </w:r>
     </w:p>
@@ -878,15 +954,17 @@
         <w:spacing w:before="100" w:beforeAutospacing="1" w:after="100" w:afterAutospacing="1" w:line="240" w:lineRule="auto"/>
         <w:rPr>
           <w:rFonts w:ascii="Times New Roman" w:eastAsia="Times New Roman" w:hAnsi="Times New Roman" w:cs="Times New Roman"/>
-          <w:sz w:val="24"/>
-          <w:szCs w:val="24"/>
-          <w:lang w:eastAsia="pt-BR"/>
-        </w:rPr>
-      </w:pPr>
-      <w:r>
-        <w:rPr>
-          <w:rFonts w:ascii="Times New Roman" w:eastAsia="Times New Roman" w:hAnsi="Times New Roman" w:cs="Times New Roman"/>
-          <w:bCs/>
+          <w:color w:val="FF0000"/>
+          <w:sz w:val="24"/>
+          <w:szCs w:val="24"/>
+          <w:lang w:eastAsia="pt-BR"/>
+        </w:rPr>
+      </w:pPr>
+      <w:r>
+        <w:rPr>
+          <w:rFonts w:ascii="Times New Roman" w:eastAsia="Times New Roman" w:hAnsi="Times New Roman" w:cs="Times New Roman"/>
+          <w:bCs/>
+          <w:color w:val="FF0000"/>
           <w:sz w:val="24"/>
           <w:szCs w:val="24"/>
           <w:lang w:eastAsia="pt-BR"/>
@@ -897,6 +975,7 @@
         <w:rPr>
           <w:rFonts w:ascii="Times New Roman" w:eastAsia="Times New Roman" w:hAnsi="Times New Roman" w:cs="Times New Roman"/>
           <w:bCs/>
+          <w:color w:val="FF0000"/>
           <w:sz w:val="24"/>
           <w:szCs w:val="24"/>
           <w:lang w:eastAsia="pt-BR"/>
@@ -913,15 +992,17 @@
         <w:spacing w:before="100" w:beforeAutospacing="1" w:after="100" w:afterAutospacing="1" w:line="240" w:lineRule="auto"/>
         <w:rPr>
           <w:rFonts w:ascii="Times New Roman" w:eastAsia="Times New Roman" w:hAnsi="Times New Roman" w:cs="Times New Roman"/>
-          <w:sz w:val="24"/>
-          <w:szCs w:val="24"/>
-          <w:lang w:eastAsia="pt-BR"/>
-        </w:rPr>
-      </w:pPr>
-      <w:r>
-        <w:rPr>
-          <w:rFonts w:ascii="Times New Roman" w:eastAsia="Times New Roman" w:hAnsi="Times New Roman" w:cs="Times New Roman"/>
-          <w:bCs/>
+          <w:color w:val="FF0000"/>
+          <w:sz w:val="24"/>
+          <w:szCs w:val="24"/>
+          <w:lang w:eastAsia="pt-BR"/>
+        </w:rPr>
+      </w:pPr>
+      <w:r>
+        <w:rPr>
+          <w:rFonts w:ascii="Times New Roman" w:eastAsia="Times New Roman" w:hAnsi="Times New Roman" w:cs="Times New Roman"/>
+          <w:bCs/>
+          <w:color w:val="FF0000"/>
           <w:sz w:val="24"/>
           <w:szCs w:val="24"/>
           <w:lang w:eastAsia="pt-BR"/>
@@ -964,6 +1045,7 @@
           <w:lang w:eastAsia="pt-BR"/>
         </w:rPr>
       </w:pPr>
+      <w:proofErr w:type="gramStart"/>
       <w:r>
         <w:rPr>
           <w:rFonts w:ascii="Segoe UI Symbol" w:eastAsia="Times New Roman" w:hAnsi="Segoe UI Symbol" w:cs="Segoe UI Symbol"/>
@@ -984,7 +1066,19 @@
           <w:szCs w:val="27"/>
           <w:lang w:eastAsia="pt-BR"/>
         </w:rPr>
-        <w:t xml:space="preserve"> Conteúdo de valor e diferenciação</w:t>
+        <w:t xml:space="preserve"> Conteúdo</w:t>
+      </w:r>
+      <w:proofErr w:type="gramEnd"/>
+      <w:r>
+        <w:rPr>
+          <w:rFonts w:ascii="Times New Roman" w:eastAsia="Times New Roman" w:hAnsi="Times New Roman" w:cs="Times New Roman"/>
+          <w:b/>
+          <w:bCs/>
+          <w:sz w:val="27"/>
+          <w:szCs w:val="27"/>
+          <w:lang w:eastAsia="pt-BR"/>
+        </w:rPr>
+        <w:t xml:space="preserve"> de valor e diferenciação</w:t>
       </w:r>
     </w:p>
     <w:p>
@@ -1194,7 +1288,27 @@
           <w:szCs w:val="24"/>
           <w:lang w:eastAsia="pt-BR"/>
         </w:rPr>
-        <w:t xml:space="preserve"> Adicione o nome da cidade ou bairro (ex: </w:t>
+        <w:t xml:space="preserve"> Adicione o nome da cidade ou bairro (</w:t>
+      </w:r>
+      <w:proofErr w:type="spellStart"/>
+      <w:r>
+        <w:rPr>
+          <w:rFonts w:ascii="Times New Roman" w:eastAsia="Times New Roman" w:hAnsi="Times New Roman" w:cs="Times New Roman"/>
+          <w:sz w:val="24"/>
+          <w:szCs w:val="24"/>
+          <w:lang w:eastAsia="pt-BR"/>
+        </w:rPr>
+        <w:t>ex</w:t>
+      </w:r>
+      <w:proofErr w:type="spellEnd"/>
+      <w:r>
+        <w:rPr>
+          <w:rFonts w:ascii="Times New Roman" w:eastAsia="Times New Roman" w:hAnsi="Times New Roman" w:cs="Times New Roman"/>
+          <w:sz w:val="24"/>
+          <w:szCs w:val="24"/>
+          <w:lang w:eastAsia="pt-BR"/>
+        </w:rPr>
+        <w:t xml:space="preserve">: </w:t>
       </w:r>
       <w:r>
         <w:rPr>
@@ -1214,7 +1328,27 @@
           <w:szCs w:val="24"/>
           <w:lang w:eastAsia="pt-BR"/>
         </w:rPr>
-        <w:t>) nos títulos e nas meta descriptions.</w:t>
+        <w:t xml:space="preserve">) nos títulos e nas meta </w:t>
+      </w:r>
+      <w:proofErr w:type="spellStart"/>
+      <w:r>
+        <w:rPr>
+          <w:rFonts w:ascii="Times New Roman" w:eastAsia="Times New Roman" w:hAnsi="Times New Roman" w:cs="Times New Roman"/>
+          <w:sz w:val="24"/>
+          <w:szCs w:val="24"/>
+          <w:lang w:eastAsia="pt-BR"/>
+        </w:rPr>
+        <w:t>descriptions</w:t>
+      </w:r>
+      <w:proofErr w:type="spellEnd"/>
+      <w:r>
+        <w:rPr>
+          <w:rFonts w:ascii="Times New Roman" w:eastAsia="Times New Roman" w:hAnsi="Times New Roman" w:cs="Times New Roman"/>
+          <w:sz w:val="24"/>
+          <w:szCs w:val="24"/>
+          <w:lang w:eastAsia="pt-BR"/>
+        </w:rPr>
+        <w:t>.</w:t>
       </w:r>
       <w:r>
         <w:rPr>
@@ -1273,7 +1407,15 @@
     </w:p>
     <w:p>
       <w:r>
-        <w:t>Oi Angelo. Sou o Reinaldo da SOSSEO que esteve aí falando sobre o Marketing e site para a FG Car.</w:t>
+        <w:t xml:space="preserve">Oi </w:t>
+      </w:r>
+      <w:proofErr w:type="spellStart"/>
+      <w:r>
+        <w:t>Angelo</w:t>
+      </w:r>
+      <w:proofErr w:type="spellEnd"/>
+      <w:r>
+        <w:t>. Sou o Reinaldo da SOSSEO que esteve aí falando sobre o Marketing e site para a FG Car.</w:t>
       </w:r>
     </w:p>
     <w:p/>
@@ -1301,7 +1443,6 @@
     <w:p/>
     <w:p>
       <w:r>
-        <w:lastRenderedPageBreak/>
         <w:t xml:space="preserve">O </w:t>
       </w:r>
       <w:r>
@@ -1311,8 +1452,13 @@
         <w:t xml:space="preserve">Site </w:t>
       </w:r>
       <w:r>
-        <w:t>(fgcarfunilariaepintura.com.br)*</w:t>
-      </w:r>
+        <w:t>(</w:t>
+      </w:r>
+      <w:proofErr w:type="gramStart"/>
+      <w:r>
+        <w:t>fgcarfunilariaepintura.com.br)*</w:t>
+      </w:r>
+      <w:proofErr w:type="gramEnd"/>
       <w:r>
         <w:t>envolvendo as principais palavras-chave semanticamente que as pessoas procuram no Google.</w:t>
       </w:r>
@@ -1371,13 +1517,26 @@
     </w:p>
     <w:p>
       <w:r>
-        <w:t xml:space="preserve">Outra estratégia com postagens de formato de vídeos Reels e Carrossel no Instagram com antes e depois. </w:t>
-      </w:r>
-    </w:p>
-    <w:p>
-      <w:r>
-        <w:t>*Agregados de Autoridade.*</w:t>
-      </w:r>
+        <w:t xml:space="preserve">Outra estratégia com postagens de formato de vídeos </w:t>
+      </w:r>
+      <w:proofErr w:type="spellStart"/>
+      <w:r>
+        <w:t>Reels</w:t>
+      </w:r>
+      <w:proofErr w:type="spellEnd"/>
+      <w:r>
+        <w:t xml:space="preserve"> e Carrossel no Instagram com antes e depois. </w:t>
+      </w:r>
+    </w:p>
+    <w:p>
+      <w:r>
+        <w:t xml:space="preserve">*Agregados de </w:t>
+      </w:r>
+      <w:proofErr w:type="gramStart"/>
+      <w:r>
+        <w:t>Autoridade.*</w:t>
+      </w:r>
+      <w:proofErr w:type="gramEnd"/>
       <w:r>
         <w:t xml:space="preserve"> </w:t>
       </w:r>
@@ -1402,7 +1561,15 @@
         <w:t>o</w:t>
       </w:r>
       <w:r>
-        <w:t xml:space="preserve"> em mais de 20 diretórios de páginas configurados com (NAP) nome, endereço e telefone e conteúdo persuasivo da empresa FG Car Funilaria e Pintura automotiva em Osasco.</w:t>
+        <w:t xml:space="preserve"> em mais de 20 diretórios de páginas configurados com (NAP) nome, endereço e telefone e conteúdo persuasivo da empresa FG </w:t>
+      </w:r>
+      <w:proofErr w:type="spellStart"/>
+      <w:r>
+        <w:t>Car</w:t>
+      </w:r>
+      <w:proofErr w:type="spellEnd"/>
+      <w:r>
+        <w:t xml:space="preserve"> Funilaria e Pintura automotiva em Osasco.</w:t>
       </w:r>
     </w:p>
     <w:p>
@@ -1416,7 +1583,63 @@
         <w:t>*</w:t>
       </w:r>
       <w:r>
-        <w:t xml:space="preserve"> Osasco Fácil, Apontador, telelistas, Yelp, applocal, bingplaces, brasillocais, businessconnect, guiadeempresas, etc.</w:t>
+        <w:t xml:space="preserve"> Osasco Fácil, Apontador, </w:t>
+      </w:r>
+      <w:proofErr w:type="spellStart"/>
+      <w:r>
+        <w:t>telelistas</w:t>
+      </w:r>
+      <w:proofErr w:type="spellEnd"/>
+      <w:r>
+        <w:t xml:space="preserve">, </w:t>
+      </w:r>
+      <w:proofErr w:type="spellStart"/>
+      <w:r>
+        <w:t>Yelp</w:t>
+      </w:r>
+      <w:proofErr w:type="spellEnd"/>
+      <w:r>
+        <w:t xml:space="preserve">, </w:t>
+      </w:r>
+      <w:proofErr w:type="spellStart"/>
+      <w:r>
+        <w:t>applocal</w:t>
+      </w:r>
+      <w:proofErr w:type="spellEnd"/>
+      <w:r>
+        <w:t xml:space="preserve">, </w:t>
+      </w:r>
+      <w:proofErr w:type="spellStart"/>
+      <w:r>
+        <w:t>bingplaces</w:t>
+      </w:r>
+      <w:proofErr w:type="spellEnd"/>
+      <w:r>
+        <w:t xml:space="preserve">, </w:t>
+      </w:r>
+      <w:proofErr w:type="spellStart"/>
+      <w:r>
+        <w:t>brasillocais</w:t>
+      </w:r>
+      <w:proofErr w:type="spellEnd"/>
+      <w:r>
+        <w:t xml:space="preserve">, </w:t>
+      </w:r>
+      <w:proofErr w:type="spellStart"/>
+      <w:r>
+        <w:t>businessconnect</w:t>
+      </w:r>
+      <w:proofErr w:type="spellEnd"/>
+      <w:r>
+        <w:t xml:space="preserve">, </w:t>
+      </w:r>
+      <w:proofErr w:type="spellStart"/>
+      <w:r>
+        <w:t>guiadeempresas</w:t>
+      </w:r>
+      <w:proofErr w:type="spellEnd"/>
+      <w:r>
+        <w:t>, etc.</w:t>
       </w:r>
     </w:p>
     <w:p/>
@@ -1475,6 +1698,7 @@
     <w:p/>
     <w:p>
       <w:r>
+        <w:lastRenderedPageBreak/>
         <w:t>*</w:t>
       </w:r>
       <w:r>
@@ -1484,7 +1708,23 @@
         <w:t>*</w:t>
       </w:r>
       <w:r>
-        <w:t xml:space="preserve"> Registro de domínio do nome (registrobr) válido por 1 ano  (todo ano tem que renovar)</w:t>
+        <w:t xml:space="preserve"> Registro de domínio do nome (</w:t>
+      </w:r>
+      <w:proofErr w:type="spellStart"/>
+      <w:r>
+        <w:t>registrobr</w:t>
+      </w:r>
+      <w:proofErr w:type="spellEnd"/>
+      <w:r>
+        <w:t xml:space="preserve">) válido por 1 </w:t>
+      </w:r>
+      <w:proofErr w:type="gramStart"/>
+      <w:r>
+        <w:t>ano  (</w:t>
+      </w:r>
+      <w:proofErr w:type="gramEnd"/>
+      <w:r>
+        <w:t>todo ano tem que renovar)</w:t>
       </w:r>
     </w:p>
     <w:p/>
@@ -1493,11 +1733,16 @@
         <w:t>*</w:t>
       </w:r>
       <w:r>
-        <w:t>Valor Mensal de Manutenção e inclusão de conteúdo.</w:t>
+        <w:t xml:space="preserve">Valor Mensal de Manutenção e inclusão de </w:t>
+      </w:r>
+      <w:proofErr w:type="gramStart"/>
+      <w:r>
+        <w:t>conteúdo.</w:t>
       </w:r>
       <w:r>
         <w:t>*</w:t>
       </w:r>
+      <w:proofErr w:type="gramEnd"/>
     </w:p>
     <w:p>
       <w:r>
@@ -1539,7 +1784,15 @@
     </w:p>
     <w:p>
       <w:r>
-        <w:t>Tópicos de textos do blog e página inicial serão fornecidos pela FG CAR em comum acordo entre nossas empresas e, irão ser estruturados conforme técnicas de otimização de buscas do Google assim como necessidades de IA ChatGPT e Google Gemini.</w:t>
+        <w:t xml:space="preserve">Tópicos de textos do blog e página inicial serão fornecidos pela FG CAR em comum acordo entre nossas empresas e, irão ser estruturados conforme técnicas de otimização de buscas do Google assim como necessidades de IA </w:t>
+      </w:r>
+      <w:proofErr w:type="spellStart"/>
+      <w:r>
+        <w:t>ChatGPT</w:t>
+      </w:r>
+      <w:proofErr w:type="spellEnd"/>
+      <w:r>
+        <w:t xml:space="preserve"> e Google Gemini.</w:t>
       </w:r>
     </w:p>
     <w:p>
@@ -1574,11 +1827,80 @@
     </w:p>
     <w:p>
       <w:r>
-        <w:t xml:space="preserve">Olá, Hoje vou precisar fazer um artigo direcionado para empresários que tem seu negócio mas ainda não sabe por onde começar. Ele não conhece tráfego pago e nem orgânico e está procurando entender como pode melhorar seus lucros vendendo mais na internet. Por favor, quero que crie uma palavra-chave de calda longa persuasiva e que chame muito atenção para esse assunto e deixe em sua memória que vamos usar ela como uma variável na próxima solicitação Atue como especialista em SEO e redator de blog criativo. Crie um artigo otimizado para SEO com mais de 1.500 palavras sobre O Segredo que faz o Google recomendar sua empresa todos os dias. Este artigo para oficinas Mecânicas e oficinas de Funilaria e pintura que pode aumentar o movimento conectando site profissional, Google Perfil Empresa, redes sociais e lista de diretórios aumentando autoridade e branding da empresa. O ARTIGO deverá conter: – Título Clickbait H1 com um emoji – Um primeiro parágrafo com 156 caracteres e depois outros com 5 linhas abaixo do título H1 com texto criativo e envolvente para manter o leitor conectado – Títulos H2 com pelo menos 3 a 5 parágrafos – títulos H3 – Listas (marcadores) – CTA de urgência – Conclusão – FAQ com uma randomização de 5 a 7 perguntas frequentes relevantes Importante: Cada seção H2 deve conter pelo menos 3 a 5 parágrafos. Atenção: Cada parágrafo deverá ter no máximo 4 linhas. O artigo deve ter uma densidade de palavras-chave de 2% a 3% para a palavra-chave principal fornecida. A conclusão pode ter no máximo 1 ou 2 parágrafos, sendo bem objetiva e com um resumo claro do que foi abordado. Sempre termine com uma declaração poderosa. O foco é se posicionar para a primeira posição </w:t>
+        <w:t xml:space="preserve">Olá, </w:t>
+      </w:r>
+      <w:proofErr w:type="gramStart"/>
+      <w:r>
+        <w:t>Hoje</w:t>
+      </w:r>
+      <w:proofErr w:type="gramEnd"/>
+      <w:r>
+        <w:t xml:space="preserve"> vou precisar fazer um artigo direcionado para empresários que tem seu negócio mas ainda não sabe por onde começar. Ele não conhece tráfego pago e nem orgânico e está procurando entender como pode melhorar seus lucros vendendo mais na internet. Por favor, quero que crie uma palavra-chave de calda longa persuasiva e que chame muito atenção para esse assunto e deixe em sua memória que vamos usar ela como uma variável na próxima </w:t>
+      </w:r>
+      <w:proofErr w:type="gramStart"/>
+      <w:r>
+        <w:t>solicitação Atue</w:t>
+      </w:r>
+      <w:proofErr w:type="gramEnd"/>
+      <w:r>
+        <w:t xml:space="preserve"> como especialista em SEO e redator de blog criativo. Crie um artigo otimizado para SEO com mais de 1.500 palavras sobre O Segredo que faz o Google recomendar sua empresa todos os dias. Este artigo para oficinas Mecânicas e oficinas de Funilaria e pintura que pode aumentar o movimento conectando site profissional, Google Perfil Empresa, redes sociais e lista de diretórios aumentando autoridade e branding da empresa. O ARTIGO deverá conter: – Título </w:t>
+      </w:r>
+      <w:proofErr w:type="spellStart"/>
+      <w:r>
+        <w:t>Clickbait</w:t>
+      </w:r>
+      <w:proofErr w:type="spellEnd"/>
+      <w:r>
+        <w:t xml:space="preserve"> H1 com um </w:t>
+      </w:r>
+      <w:proofErr w:type="spellStart"/>
+      <w:r>
+        <w:t>emoji</w:t>
+      </w:r>
+      <w:proofErr w:type="spellEnd"/>
+      <w:r>
+        <w:t xml:space="preserve"> – Um primeiro parágrafo com 156 caracteres e depois outros com 5 linhas abaixo do título H1 com texto criativo e envolvente para manter o leitor conectado – Títulos H2 com pelo menos 3 a 5 parágrafos – títulos H3 – Listas (marcadores) – CTA de urgência – Conclusão – FAQ com uma randomização de 5 a 7 perguntas frequentes relevantes Importante: Cada seção H2 deve conter pelo menos 3 a 5 parágrafos. Atenção: Cada parágrafo deverá ter no máximo 4 linhas. O artigo deve ter uma densidade de palavras-chave de 2% a 3% para a palavra-chave principal fornecida. A conclusão pode ter no máximo 1 ou 2 parágrafos, sendo bem objetiva e com um resumo claro do que foi abordado. Sempre termine com uma declaração poderosa. O foco é se posicionar para a primeira posição no Google, por isso seu conteúdo deve ser inovador, único, exclusivo e envolvente, garantindo </w:t>
       </w:r>
       <w:r>
         <w:lastRenderedPageBreak/>
-        <w:t>no Google, por isso seu conteúdo deve ser inovador, único, exclusivo e envolvente, garantindo que o usuário passe muito tempo lendo e conectado ao texto. Deve atender às necessidades do usuário. Adicione um toque de humor, mas não exagere. Ao final, crie uma meta descrição clickbait com termos relevantes em letras maiúsculas, emojis e no máximo 140 caracteres. Lembre-se de variar o número de parágrafos entre 3 a 5 em cada seção H2. Importante: Antes de criar, gere um esboço dos títulos para o usuário validar se pode prosseguir ou não; caso contrário, recrie o contorno. Sempre pergunte se o esboço está bom antes de prosseguir. A saída deve estar no formato markdown.— Antes de criar o esboço, caso o usuário não tenha fornecido a palavra-chave, pergunte qual palavra-chave deseja usar para o artigo. Pergunte ao usuário se o esboço é bom e em qual idioma ele deseja. Se não especificarem, faça-o em .Além disso, pergunte quais termos eles desejam usar para forçar uma citação extremamente breve das seguintes palavras-chave em forma de âncora. Você pode usar sinônimos semânticos. Importante: Deve ser apenas uma frase, e nessa frase conter um significado/sinônimo semântico das âncoras. Pare, pense analiticamente, respire fundo e então comece.</w:t>
+        <w:t xml:space="preserve">que o usuário passe muito tempo lendo e conectado ao texto. Deve atender às necessidades do usuário. Adicione um toque de humor, mas não exagere. Ao final, crie uma meta descrição </w:t>
+      </w:r>
+      <w:proofErr w:type="spellStart"/>
+      <w:r>
+        <w:t>clickbait</w:t>
+      </w:r>
+      <w:proofErr w:type="spellEnd"/>
+      <w:r>
+        <w:t xml:space="preserve"> com termos relevantes em letras maiúsculas, </w:t>
+      </w:r>
+      <w:proofErr w:type="spellStart"/>
+      <w:r>
+        <w:t>emojis</w:t>
+      </w:r>
+      <w:proofErr w:type="spellEnd"/>
+      <w:r>
+        <w:t xml:space="preserve"> e no máximo 140 caracteres. Lembre-se de variar o número de parágrafos entre 3 a 5 em cada seção H2. Importante: Antes de criar, gere um esboço dos títulos para o usuário validar se pode prosseguir ou não; caso contrário, recrie o contorno. Sempre pergunte se o esboço está bom antes de prosseguir. A saída deve estar no formato </w:t>
+      </w:r>
+      <w:proofErr w:type="spellStart"/>
+      <w:proofErr w:type="gramStart"/>
+      <w:r>
+        <w:t>markdown</w:t>
+      </w:r>
+      <w:proofErr w:type="spellEnd"/>
+      <w:r>
+        <w:t>.—</w:t>
+      </w:r>
+      <w:proofErr w:type="gramEnd"/>
+      <w:r>
+        <w:t xml:space="preserve"> Antes de criar o esboço, caso o usuário não tenha fornecido a palavra-chave, pergunte qual palavra-chave deseja usar para o artigo. Pergunte ao usuário se o esboço é bom e em qual idioma ele deseja. Se não especificarem, faça-o </w:t>
+      </w:r>
+      <w:proofErr w:type="gramStart"/>
+      <w:r>
+        <w:t>em .Além</w:t>
+      </w:r>
+      <w:proofErr w:type="gramEnd"/>
+      <w:r>
+        <w:t xml:space="preserve"> disso, pergunte quais termos eles desejam usar para forçar uma citação extremamente breve das seguintes palavras-chave em forma de âncora. Você pode usar sinônimos semânticos. Importante: Deve ser apenas uma frase, e nessa frase conter um significado/sinônimo semântico das âncoras. Pare, pense analiticamente, respire fundo e então comece.</w:t>
       </w:r>
     </w:p>
     <w:sectPr>

</xml_diff>

<commit_message>
Atualiza numero oficial de WhatsApp para 11 94772-7682 em todo o site e blog da FG Car
</commit_message>
<xml_diff>
--- a/Artigos para criar no Blog FG Car Oficina.docx
+++ b/Artigos para criar no Blog FG Car Oficina.docx
@@ -840,6 +840,17 @@
         <w:t>FGCar</w:t>
       </w:r>
       <w:proofErr w:type="spellEnd"/>
+      <w:r>
+        <w:rPr>
+          <w:rFonts w:ascii="Times New Roman" w:eastAsia="Times New Roman" w:hAnsi="Times New Roman" w:cs="Times New Roman"/>
+          <w:b/>
+          <w:bCs/>
+          <w:sz w:val="27"/>
+          <w:szCs w:val="27"/>
+          <w:lang w:eastAsia="pt-BR"/>
+        </w:rPr>
+        <w:t xml:space="preserve"> em Osasco</w:t>
+      </w:r>
     </w:p>
     <w:p>
       <w:pPr>
@@ -1045,7 +1056,6 @@
           <w:lang w:eastAsia="pt-BR"/>
         </w:rPr>
       </w:pPr>
-      <w:proofErr w:type="gramStart"/>
       <w:r>
         <w:rPr>
           <w:rFonts w:ascii="Segoe UI Symbol" w:eastAsia="Times New Roman" w:hAnsi="Segoe UI Symbol" w:cs="Segoe UI Symbol"/>
@@ -1059,16 +1069,15 @@
       </w:r>
       <w:r>
         <w:rPr>
-          <w:rFonts w:ascii="Times New Roman" w:eastAsia="Times New Roman" w:hAnsi="Times New Roman" w:cs="Times New Roman"/>
+          <w:rFonts w:ascii="Segoe UI Symbol" w:eastAsia="Times New Roman" w:hAnsi="Segoe UI Symbol" w:cs="Segoe UI Symbol"/>
           <w:b/>
           <w:bCs/>
           <w:sz w:val="27"/>
           <w:szCs w:val="27"/>
           <w:lang w:eastAsia="pt-BR"/>
         </w:rPr>
-        <w:t xml:space="preserve"> Conteúdo</w:t>
-      </w:r>
-      <w:proofErr w:type="gramEnd"/>
+        <w:t>-</w:t>
+      </w:r>
       <w:r>
         <w:rPr>
           <w:rFonts w:ascii="Times New Roman" w:eastAsia="Times New Roman" w:hAnsi="Times New Roman" w:cs="Times New Roman"/>
@@ -1078,7 +1087,7 @@
           <w:szCs w:val="27"/>
           <w:lang w:eastAsia="pt-BR"/>
         </w:rPr>
-        <w:t xml:space="preserve"> de valor e diferenciação</w:t>
+        <w:t xml:space="preserve"> Conteúdo de valor e diferenciação</w:t>
       </w:r>
     </w:p>
     <w:p>

</xml_diff>